<commit_message>
Add SB 79 briefing charts, update skills and intel, fix transcriber
- Add pipeline analysis charts for SB 79 briefing: citywide filings,
  downtown filing collapse, completion forecast, pipeline funnel,
  projected production, rent growth comparison, D-District projections
- Add Joyce rebuttal generator, inclusionary rate analysis, unit counter
- Update pipeline collapse doc and comparison chart generators
- Update ca-housing-law skill with recent intel (359 items, through 6/28)
- Update civic-pipeline skill for current architecture
- Add CLAUDE.md and transport deep-read recovery notes
- Fix transcribe.py minor change

Co-Authored-By: Claude Opus 4.6 <noreply@anthropic.com>
</commit_message>
<xml_diff>
--- a/share/oceanside-sb79-briefing/Oceanside 2026 Housing Pipeline Collapse.docx
+++ b/share/oceanside-sb79-briefing/Oceanside 2026 Housing Pipeline Collapse.docx
@@ -45,7 +45,7 @@
     </w:p>
     <w:p>
       <w:r>
-        <w:t>That application — DB26-00001, a 142-unit multifamily project at 1640 Oceanside Boulevard — was filed under AB 2011 (the Affordable Housing and High Road Jobs Act), a state law that converts the approval to a ministerial process. The developer used state law to bypass city discretionary review entirely. Without AB 2011, the count would be zero.</w:t>
+        <w:t>That application — DB26-00001, a 142-unit multifamily project at 1640 Oceanside Boulevard — was filed as a Density Bonus Application under state law. The project includes a minimum of 21 affordable units (15% inclusionary requirement per Oceanside's December 2023 ordinance). Without this state-law filing, the count would be zero.</w:t>
       </w:r>
     </w:p>
     <w:p>
@@ -549,12 +549,12 @@
         <w:pStyle w:val="Heading2"/>
       </w:pPr>
       <w:r>
-        <w:t>2025 vs. 2026: Discretionary and Ministerial</w:t>
+        <w:t>Citywide Housing Filings: Nine-Year Trend (2018–2026)</w:t>
       </w:r>
     </w:p>
     <w:p>
       <w:r>
-        <w:t>The city's eTRAKiT system has two search portals: a project search for discretionary applications and a permit search for ministerial building permits. The following table combines both to show total housing activity.</w:t>
+        <w:t>The following table shows all housing units filed with the city, by year and type. 2018–2025 data is from HCD Annual Progress Report Table A (the same source as the D-District chart above). 2026 is reconstructed from eTRAKiT, excluding units already counted in prior years' filings (Olive Park, North River Farms tract lots).</w:t>
       </w:r>
     </w:p>
     <w:tbl>
@@ -565,50 +565,101 @@
         <w:tblLook w:firstColumn="1" w:firstRow="1" w:lastColumn="0" w:lastRow="0" w:noHBand="0" w:noVBand="1" w:val="04A0"/>
       </w:tblPr>
       <w:tblGrid>
-        <w:gridCol w:w="2880"/>
-        <w:gridCol w:w="2880"/>
-        <w:gridCol w:w="2880"/>
+        <w:gridCol w:w="1440"/>
+        <w:gridCol w:w="1440"/>
+        <w:gridCol w:w="1440"/>
+        <w:gridCol w:w="1440"/>
+        <w:gridCol w:w="1440"/>
+        <w:gridCol w:w="1440"/>
       </w:tblGrid>
       <w:tr>
         <w:tc>
           <w:tcPr>
-            <w:tcW w:type="dxa" w:w="2880"/>
+            <w:tcW w:type="dxa" w:w="1440"/>
           </w:tcPr>
           <w:p>
             <w:r>
               <w:rPr>
                 <w:b/>
+                <w:sz w:val="18"/>
               </w:rPr>
+              <w:t>Year</w:t>
             </w:r>
           </w:p>
         </w:tc>
         <w:tc>
           <w:tcPr>
-            <w:tcW w:type="dxa" w:w="2880"/>
+            <w:tcW w:type="dxa" w:w="1440"/>
           </w:tcPr>
           <w:p>
             <w:r>
               <w:rPr>
                 <w:b/>
+                <w:sz w:val="18"/>
               </w:rPr>
-              <w:t>2025</w:t>
-              <w:br/>
-              <w:t>(full year)</w:t>
+              <w:t>ADU</w:t>
             </w:r>
           </w:p>
         </w:tc>
         <w:tc>
           <w:tcPr>
-            <w:tcW w:type="dxa" w:w="2880"/>
+            <w:tcW w:type="dxa" w:w="1440"/>
           </w:tcPr>
           <w:p>
             <w:r>
               <w:rPr>
                 <w:b/>
+                <w:sz w:val="18"/>
               </w:rPr>
-              <w:t>2026</w:t>
+              <w:t>SFD/</w:t>
               <w:br/>
-              <w:t>(Jan–Jun)</w:t>
+              <w:t>SFA</w:t>
+            </w:r>
+          </w:p>
+        </w:tc>
+        <w:tc>
+          <w:tcPr>
+            <w:tcW w:type="dxa" w:w="1440"/>
+          </w:tcPr>
+          <w:p>
+            <w:r>
+              <w:rPr>
+                <w:b/>
+                <w:sz w:val="18"/>
+              </w:rPr>
+              <w:t>2–4</w:t>
+              <w:br/>
+              <w:t>Unit</w:t>
+            </w:r>
+          </w:p>
+        </w:tc>
+        <w:tc>
+          <w:tcPr>
+            <w:tcW w:type="dxa" w:w="1440"/>
+          </w:tcPr>
+          <w:p>
+            <w:r>
+              <w:rPr>
+                <w:b/>
+                <w:sz w:val="18"/>
+              </w:rPr>
+              <w:t>5+</w:t>
+              <w:br/>
+              <w:t>Unit</w:t>
+            </w:r>
+          </w:p>
+        </w:tc>
+        <w:tc>
+          <w:tcPr>
+            <w:tcW w:type="dxa" w:w="1440"/>
+          </w:tcPr>
+          <w:p>
+            <w:r>
+              <w:rPr>
+                <w:b/>
+                <w:sz w:val="18"/>
+              </w:rPr>
+              <w:t>Total</w:t>
             </w:r>
           </w:p>
         </w:tc>
@@ -616,41 +667,79 @@
       <w:tr>
         <w:tc>
           <w:tcPr>
-            <w:tcW w:type="dxa" w:w="2880"/>
+            <w:tcW w:type="dxa" w:w="1440"/>
           </w:tcPr>
           <w:p>
             <w:r>
               <w:rPr>
-                <w:b/>
-                <w:sz w:val="20"/>
+                <w:sz w:val="18"/>
               </w:rPr>
-              <w:t>DISCRETIONARY (project search)</w:t>
+              <w:t>2018</w:t>
             </w:r>
           </w:p>
         </w:tc>
         <w:tc>
           <w:tcPr>
-            <w:tcW w:type="dxa" w:w="2880"/>
+            <w:tcW w:type="dxa" w:w="1440"/>
           </w:tcPr>
           <w:p>
             <w:r>
               <w:rPr>
-                <w:b/>
-                <w:sz w:val="20"/>
+                <w:sz w:val="18"/>
               </w:rPr>
+              <w:t>34</w:t>
             </w:r>
           </w:p>
         </w:tc>
         <w:tc>
           <w:tcPr>
-            <w:tcW w:type="dxa" w:w="2880"/>
+            <w:tcW w:type="dxa" w:w="1440"/>
           </w:tcPr>
           <w:p>
             <w:r>
               <w:rPr>
-                <w:b/>
-                <w:sz w:val="20"/>
+                <w:sz w:val="18"/>
               </w:rPr>
+              <w:t>347</w:t>
+            </w:r>
+          </w:p>
+        </w:tc>
+        <w:tc>
+          <w:tcPr>
+            <w:tcW w:type="dxa" w:w="1440"/>
+          </w:tcPr>
+          <w:p>
+            <w:r>
+              <w:rPr>
+                <w:sz w:val="18"/>
+              </w:rPr>
+              <w:t>100</w:t>
+            </w:r>
+          </w:p>
+        </w:tc>
+        <w:tc>
+          <w:tcPr>
+            <w:tcW w:type="dxa" w:w="1440"/>
+          </w:tcPr>
+          <w:p>
+            <w:r>
+              <w:rPr>
+                <w:sz w:val="18"/>
+              </w:rPr>
+              <w:t>78</w:t>
+            </w:r>
+          </w:p>
+        </w:tc>
+        <w:tc>
+          <w:tcPr>
+            <w:tcW w:type="dxa" w:w="1440"/>
+          </w:tcPr>
+          <w:p>
+            <w:r>
+              <w:rPr>
+                <w:sz w:val="18"/>
+              </w:rPr>
+              <w:t>559</w:t>
             </w:r>
           </w:p>
         </w:tc>
@@ -658,31 +747,79 @@
       <w:tr>
         <w:tc>
           <w:tcPr>
-            <w:tcW w:type="dxa" w:w="2880"/>
+            <w:tcW w:type="dxa" w:w="1440"/>
           </w:tcPr>
           <w:p>
             <w:r>
-              <w:t xml:space="preserve">  Housing applications</w:t>
+              <w:rPr>
+                <w:sz w:val="18"/>
+              </w:rPr>
+              <w:t>2019</w:t>
             </w:r>
           </w:p>
         </w:tc>
         <w:tc>
           <w:tcPr>
-            <w:tcW w:type="dxa" w:w="2880"/>
+            <w:tcW w:type="dxa" w:w="1440"/>
           </w:tcPr>
           <w:p>
             <w:r>
-              <w:t>18</w:t>
+              <w:rPr>
+                <w:sz w:val="18"/>
+              </w:rPr>
+              <w:t>31</w:t>
             </w:r>
           </w:p>
         </w:tc>
         <w:tc>
           <w:tcPr>
-            <w:tcW w:type="dxa" w:w="2880"/>
+            <w:tcW w:type="dxa" w:w="1440"/>
           </w:tcPr>
           <w:p>
             <w:r>
-              <w:t>1</w:t>
+              <w:rPr>
+                <w:sz w:val="18"/>
+              </w:rPr>
+              <w:t>227</w:t>
+            </w:r>
+          </w:p>
+        </w:tc>
+        <w:tc>
+          <w:tcPr>
+            <w:tcW w:type="dxa" w:w="1440"/>
+          </w:tcPr>
+          <w:p>
+            <w:r>
+              <w:rPr>
+                <w:sz w:val="18"/>
+              </w:rPr>
+              <w:t>22</w:t>
+            </w:r>
+          </w:p>
+        </w:tc>
+        <w:tc>
+          <w:tcPr>
+            <w:tcW w:type="dxa" w:w="1440"/>
+          </w:tcPr>
+          <w:p>
+            <w:r>
+              <w:rPr>
+                <w:sz w:val="18"/>
+              </w:rPr>
+              <w:t>810</w:t>
+            </w:r>
+          </w:p>
+        </w:tc>
+        <w:tc>
+          <w:tcPr>
+            <w:tcW w:type="dxa" w:w="1440"/>
+          </w:tcPr>
+          <w:p>
+            <w:r>
+              <w:rPr>
+                <w:sz w:val="18"/>
+              </w:rPr>
+              <w:t>1,090</w:t>
             </w:r>
           </w:p>
         </w:tc>
@@ -690,67 +827,79 @@
       <w:tr>
         <w:tc>
           <w:tcPr>
-            <w:tcW w:type="dxa" w:w="2880"/>
-          </w:tcPr>
-          <w:p>
-            <w:r/>
-          </w:p>
-        </w:tc>
-        <w:tc>
-          <w:tcPr>
-            <w:tcW w:type="dxa" w:w="2880"/>
-          </w:tcPr>
-          <w:p>
-            <w:r/>
-          </w:p>
-        </w:tc>
-        <w:tc>
-          <w:tcPr>
-            <w:tcW w:type="dxa" w:w="2880"/>
-          </w:tcPr>
-          <w:p>
-            <w:r/>
-          </w:p>
-        </w:tc>
-      </w:tr>
-      <w:tr>
-        <w:tc>
-          <w:tcPr>
-            <w:tcW w:type="dxa" w:w="2880"/>
+            <w:tcW w:type="dxa" w:w="1440"/>
           </w:tcPr>
           <w:p>
             <w:r>
               <w:rPr>
-                <w:b/>
-                <w:sz w:val="20"/>
+                <w:sz w:val="18"/>
               </w:rPr>
-              <w:t>MINISTERIAL (building permits)</w:t>
+              <w:t>2020</w:t>
             </w:r>
           </w:p>
         </w:tc>
         <w:tc>
           <w:tcPr>
-            <w:tcW w:type="dxa" w:w="2880"/>
+            <w:tcW w:type="dxa" w:w="1440"/>
           </w:tcPr>
           <w:p>
             <w:r>
               <w:rPr>
-                <w:b/>
-                <w:sz w:val="20"/>
+                <w:sz w:val="18"/>
               </w:rPr>
+              <w:t>42</w:t>
             </w:r>
           </w:p>
         </w:tc>
         <w:tc>
           <w:tcPr>
-            <w:tcW w:type="dxa" w:w="2880"/>
+            <w:tcW w:type="dxa" w:w="1440"/>
           </w:tcPr>
           <w:p>
             <w:r>
               <w:rPr>
-                <w:b/>
-                <w:sz w:val="20"/>
+                <w:sz w:val="18"/>
               </w:rPr>
+              <w:t>52</w:t>
+            </w:r>
+          </w:p>
+        </w:tc>
+        <w:tc>
+          <w:tcPr>
+            <w:tcW w:type="dxa" w:w="1440"/>
+          </w:tcPr>
+          <w:p>
+            <w:r>
+              <w:rPr>
+                <w:sz w:val="18"/>
+              </w:rPr>
+              <w:t>22</w:t>
+            </w:r>
+          </w:p>
+        </w:tc>
+        <w:tc>
+          <w:tcPr>
+            <w:tcW w:type="dxa" w:w="1440"/>
+          </w:tcPr>
+          <w:p>
+            <w:r>
+              <w:rPr>
+                <w:sz w:val="18"/>
+              </w:rPr>
+              <w:t>283</w:t>
+            </w:r>
+          </w:p>
+        </w:tc>
+        <w:tc>
+          <w:tcPr>
+            <w:tcW w:type="dxa" w:w="1440"/>
+          </w:tcPr>
+          <w:p>
+            <w:r>
+              <w:rPr>
+                <w:sz w:val="18"/>
+              </w:rPr>
+              <w:t>399</w:t>
             </w:r>
           </w:p>
         </w:tc>
@@ -758,31 +907,79 @@
       <w:tr>
         <w:tc>
           <w:tcPr>
-            <w:tcW w:type="dxa" w:w="2880"/>
+            <w:tcW w:type="dxa" w:w="1440"/>
           </w:tcPr>
           <w:p>
             <w:r>
-              <w:t xml:space="preserve">  ADUs</w:t>
+              <w:rPr>
+                <w:sz w:val="18"/>
+              </w:rPr>
+              <w:t>2021</w:t>
             </w:r>
           </w:p>
         </w:tc>
         <w:tc>
           <w:tcPr>
-            <w:tcW w:type="dxa" w:w="2880"/>
+            <w:tcW w:type="dxa" w:w="1440"/>
           </w:tcPr>
           <w:p>
             <w:r>
-              <w:t>156 units</w:t>
+              <w:rPr>
+                <w:sz w:val="18"/>
+              </w:rPr>
+              <w:t>146</w:t>
             </w:r>
           </w:p>
         </w:tc>
         <w:tc>
           <w:tcPr>
-            <w:tcW w:type="dxa" w:w="2880"/>
+            <w:tcW w:type="dxa" w:w="1440"/>
           </w:tcPr>
           <w:p>
             <w:r>
-              <w:t>66 units</w:t>
+              <w:rPr>
+                <w:sz w:val="18"/>
+              </w:rPr>
+              <w:t>245</w:t>
+            </w:r>
+          </w:p>
+        </w:tc>
+        <w:tc>
+          <w:tcPr>
+            <w:tcW w:type="dxa" w:w="1440"/>
+          </w:tcPr>
+          <w:p>
+            <w:r>
+              <w:rPr>
+                <w:sz w:val="18"/>
+              </w:rPr>
+              <w:t>57</w:t>
+            </w:r>
+          </w:p>
+        </w:tc>
+        <w:tc>
+          <w:tcPr>
+            <w:tcW w:type="dxa" w:w="1440"/>
+          </w:tcPr>
+          <w:p>
+            <w:r>
+              <w:rPr>
+                <w:sz w:val="18"/>
+              </w:rPr>
+              <w:t>1,250</w:t>
+            </w:r>
+          </w:p>
+        </w:tc>
+        <w:tc>
+          <w:tcPr>
+            <w:tcW w:type="dxa" w:w="1440"/>
+          </w:tcPr>
+          <w:p>
+            <w:r>
+              <w:rPr>
+                <w:sz w:val="18"/>
+              </w:rPr>
+              <w:t>1,698</w:t>
             </w:r>
           </w:p>
         </w:tc>
@@ -790,31 +987,79 @@
       <w:tr>
         <w:tc>
           <w:tcPr>
-            <w:tcW w:type="dxa" w:w="2880"/>
+            <w:tcW w:type="dxa" w:w="1440"/>
           </w:tcPr>
           <w:p>
             <w:r>
-              <w:t xml:space="preserve">  Single Family</w:t>
+              <w:rPr>
+                <w:sz w:val="18"/>
+              </w:rPr>
+              <w:t>2022</w:t>
             </w:r>
           </w:p>
         </w:tc>
         <w:tc>
           <w:tcPr>
-            <w:tcW w:type="dxa" w:w="2880"/>
+            <w:tcW w:type="dxa" w:w="1440"/>
           </w:tcPr>
           <w:p>
             <w:r>
-              <w:t>285 units</w:t>
+              <w:rPr>
+                <w:sz w:val="18"/>
+              </w:rPr>
+              <w:t>187</w:t>
             </w:r>
           </w:p>
         </w:tc>
         <w:tc>
           <w:tcPr>
-            <w:tcW w:type="dxa" w:w="2880"/>
+            <w:tcW w:type="dxa" w:w="1440"/>
           </w:tcPr>
           <w:p>
             <w:r>
-              <w:t>60 units</w:t>
+              <w:rPr>
+                <w:sz w:val="18"/>
+              </w:rPr>
+              <w:t>200</w:t>
+            </w:r>
+          </w:p>
+        </w:tc>
+        <w:tc>
+          <w:tcPr>
+            <w:tcW w:type="dxa" w:w="1440"/>
+          </w:tcPr>
+          <w:p>
+            <w:r>
+              <w:rPr>
+                <w:sz w:val="18"/>
+              </w:rPr>
+              <w:t>36</w:t>
+            </w:r>
+          </w:p>
+        </w:tc>
+        <w:tc>
+          <w:tcPr>
+            <w:tcW w:type="dxa" w:w="1440"/>
+          </w:tcPr>
+          <w:p>
+            <w:r>
+              <w:rPr>
+                <w:sz w:val="18"/>
+              </w:rPr>
+              <w:t>2,774</w:t>
+            </w:r>
+          </w:p>
+        </w:tc>
+        <w:tc>
+          <w:tcPr>
+            <w:tcW w:type="dxa" w:w="1440"/>
+          </w:tcPr>
+          <w:p>
+            <w:r>
+              <w:rPr>
+                <w:sz w:val="18"/>
+              </w:rPr>
+              <w:t>3,197</w:t>
             </w:r>
           </w:p>
         </w:tc>
@@ -822,31 +1067,79 @@
       <w:tr>
         <w:tc>
           <w:tcPr>
-            <w:tcW w:type="dxa" w:w="2880"/>
+            <w:tcW w:type="dxa" w:w="1440"/>
           </w:tcPr>
           <w:p>
             <w:r>
-              <w:t xml:space="preserve">  Duplex</w:t>
+              <w:rPr>
+                <w:sz w:val="18"/>
+              </w:rPr>
+              <w:t>2023</w:t>
             </w:r>
           </w:p>
         </w:tc>
         <w:tc>
           <w:tcPr>
-            <w:tcW w:type="dxa" w:w="2880"/>
+            <w:tcW w:type="dxa" w:w="1440"/>
           </w:tcPr>
           <w:p>
             <w:r>
-              <w:t>46 units</w:t>
+              <w:rPr>
+                <w:sz w:val="18"/>
+              </w:rPr>
+              <w:t>149</w:t>
             </w:r>
           </w:p>
         </w:tc>
         <w:tc>
           <w:tcPr>
-            <w:tcW w:type="dxa" w:w="2880"/>
+            <w:tcW w:type="dxa" w:w="1440"/>
           </w:tcPr>
           <w:p>
             <w:r>
-              <w:t>2 units</w:t>
+              <w:rPr>
+                <w:sz w:val="18"/>
+              </w:rPr>
+              <w:t>36</w:t>
+            </w:r>
+          </w:p>
+        </w:tc>
+        <w:tc>
+          <w:tcPr>
+            <w:tcW w:type="dxa" w:w="1440"/>
+          </w:tcPr>
+          <w:p>
+            <w:r>
+              <w:rPr>
+                <w:sz w:val="18"/>
+              </w:rPr>
+              <w:t>12</w:t>
+            </w:r>
+          </w:p>
+        </w:tc>
+        <w:tc>
+          <w:tcPr>
+            <w:tcW w:type="dxa" w:w="1440"/>
+          </w:tcPr>
+          <w:p>
+            <w:r>
+              <w:rPr>
+                <w:sz w:val="18"/>
+              </w:rPr>
+              <w:t>1,765</w:t>
+            </w:r>
+          </w:p>
+        </w:tc>
+        <w:tc>
+          <w:tcPr>
+            <w:tcW w:type="dxa" w:w="1440"/>
+          </w:tcPr>
+          <w:p>
+            <w:r>
+              <w:rPr>
+                <w:sz w:val="18"/>
+              </w:rPr>
+              <w:t>1,962</w:t>
             </w:r>
           </w:p>
         </w:tc>
@@ -854,31 +1147,337 @@
       <w:tr>
         <w:tc>
           <w:tcPr>
-            <w:tcW w:type="dxa" w:w="2880"/>
+            <w:tcW w:type="dxa" w:w="1440"/>
           </w:tcPr>
           <w:p>
             <w:r>
-              <w:t xml:space="preserve">  Multi Family + Mid/High Rise</w:t>
+              <w:rPr>
+                <w:sz w:val="18"/>
+              </w:rPr>
+              <w:t>2024</w:t>
             </w:r>
           </w:p>
         </w:tc>
         <w:tc>
           <w:tcPr>
-            <w:tcW w:type="dxa" w:w="2880"/>
+            <w:tcW w:type="dxa" w:w="1440"/>
           </w:tcPr>
           <w:p>
             <w:r>
-              <w:t>243 units (est.)</w:t>
+              <w:rPr>
+                <w:sz w:val="18"/>
+              </w:rPr>
+              <w:t>197</w:t>
             </w:r>
           </w:p>
         </w:tc>
         <w:tc>
           <w:tcPr>
-            <w:tcW w:type="dxa" w:w="2880"/>
+            <w:tcW w:type="dxa" w:w="1440"/>
           </w:tcPr>
           <w:p>
             <w:r>
-              <w:t>205 units (est.)</w:t>
+              <w:rPr>
+                <w:sz w:val="18"/>
+              </w:rPr>
+              <w:t>292</w:t>
+            </w:r>
+          </w:p>
+        </w:tc>
+        <w:tc>
+          <w:tcPr>
+            <w:tcW w:type="dxa" w:w="1440"/>
+          </w:tcPr>
+          <w:p>
+            <w:r>
+              <w:rPr>
+                <w:sz w:val="18"/>
+              </w:rPr>
+              <w:t>17</w:t>
+            </w:r>
+          </w:p>
+        </w:tc>
+        <w:tc>
+          <w:tcPr>
+            <w:tcW w:type="dxa" w:w="1440"/>
+          </w:tcPr>
+          <w:p>
+            <w:r>
+              <w:rPr>
+                <w:sz w:val="18"/>
+              </w:rPr>
+              <w:t>1,515</w:t>
+            </w:r>
+          </w:p>
+        </w:tc>
+        <w:tc>
+          <w:tcPr>
+            <w:tcW w:type="dxa" w:w="1440"/>
+          </w:tcPr>
+          <w:p>
+            <w:r>
+              <w:rPr>
+                <w:sz w:val="18"/>
+              </w:rPr>
+              <w:t>2,021</w:t>
+            </w:r>
+          </w:p>
+        </w:tc>
+      </w:tr>
+      <w:tr>
+        <w:tc>
+          <w:tcPr>
+            <w:tcW w:type="dxa" w:w="1440"/>
+          </w:tcPr>
+          <w:p>
+            <w:r>
+              <w:rPr>
+                <w:sz w:val="18"/>
+              </w:rPr>
+              <w:t>2025</w:t>
+            </w:r>
+          </w:p>
+        </w:tc>
+        <w:tc>
+          <w:tcPr>
+            <w:tcW w:type="dxa" w:w="1440"/>
+          </w:tcPr>
+          <w:p>
+            <w:r>
+              <w:rPr>
+                <w:sz w:val="18"/>
+              </w:rPr>
+              <w:t>147</w:t>
+            </w:r>
+          </w:p>
+        </w:tc>
+        <w:tc>
+          <w:tcPr>
+            <w:tcW w:type="dxa" w:w="1440"/>
+          </w:tcPr>
+          <w:p>
+            <w:r>
+              <w:rPr>
+                <w:sz w:val="18"/>
+              </w:rPr>
+              <w:t>409</w:t>
+            </w:r>
+          </w:p>
+        </w:tc>
+        <w:tc>
+          <w:tcPr>
+            <w:tcW w:type="dxa" w:w="1440"/>
+          </w:tcPr>
+          <w:p>
+            <w:r>
+              <w:rPr>
+                <w:sz w:val="18"/>
+              </w:rPr>
+              <w:t>9</w:t>
+            </w:r>
+          </w:p>
+        </w:tc>
+        <w:tc>
+          <w:tcPr>
+            <w:tcW w:type="dxa" w:w="1440"/>
+          </w:tcPr>
+          <w:p>
+            <w:r>
+              <w:rPr>
+                <w:sz w:val="18"/>
+              </w:rPr>
+              <w:t>1,389</w:t>
+            </w:r>
+          </w:p>
+        </w:tc>
+        <w:tc>
+          <w:tcPr>
+            <w:tcW w:type="dxa" w:w="1440"/>
+          </w:tcPr>
+          <w:p>
+            <w:r>
+              <w:rPr>
+                <w:sz w:val="18"/>
+              </w:rPr>
+              <w:t>1,954</w:t>
+            </w:r>
+          </w:p>
+        </w:tc>
+      </w:tr>
+      <w:tr>
+        <w:tc>
+          <w:tcPr>
+            <w:tcW w:type="dxa" w:w="1440"/>
+          </w:tcPr>
+          <w:p>
+            <w:r>
+              <w:rPr>
+                <w:b/>
+                <w:color w:val="8B0000"/>
+                <w:sz w:val="18"/>
+              </w:rPr>
+              <w:t>2026 (Jan–Jun)</w:t>
+            </w:r>
+          </w:p>
+        </w:tc>
+        <w:tc>
+          <w:tcPr>
+            <w:tcW w:type="dxa" w:w="1440"/>
+          </w:tcPr>
+          <w:p>
+            <w:r>
+              <w:rPr>
+                <w:b/>
+                <w:color w:val="8B0000"/>
+                <w:sz w:val="18"/>
+              </w:rPr>
+              <w:t>67</w:t>
+            </w:r>
+          </w:p>
+        </w:tc>
+        <w:tc>
+          <w:tcPr>
+            <w:tcW w:type="dxa" w:w="1440"/>
+          </w:tcPr>
+          <w:p>
+            <w:r>
+              <w:rPr>
+                <w:b/>
+                <w:color w:val="8B0000"/>
+                <w:sz w:val="18"/>
+              </w:rPr>
+              <w:t>4</w:t>
+            </w:r>
+          </w:p>
+        </w:tc>
+        <w:tc>
+          <w:tcPr>
+            <w:tcW w:type="dxa" w:w="1440"/>
+          </w:tcPr>
+          <w:p>
+            <w:r>
+              <w:rPr>
+                <w:b/>
+                <w:color w:val="8B0000"/>
+                <w:sz w:val="18"/>
+              </w:rPr>
+              <w:t>6</w:t>
+            </w:r>
+          </w:p>
+        </w:tc>
+        <w:tc>
+          <w:tcPr>
+            <w:tcW w:type="dxa" w:w="1440"/>
+          </w:tcPr>
+          <w:p>
+            <w:r>
+              <w:rPr>
+                <w:b/>
+                <w:color w:val="8B0000"/>
+                <w:sz w:val="18"/>
+              </w:rPr>
+              <w:t>142</w:t>
+            </w:r>
+          </w:p>
+        </w:tc>
+        <w:tc>
+          <w:tcPr>
+            <w:tcW w:type="dxa" w:w="1440"/>
+          </w:tcPr>
+          <w:p>
+            <w:r>
+              <w:rPr>
+                <w:b/>
+                <w:color w:val="8B0000"/>
+                <w:sz w:val="18"/>
+              </w:rPr>
+              <w:t>219</w:t>
+            </w:r>
+          </w:p>
+        </w:tc>
+      </w:tr>
+      <w:tr>
+        <w:tc>
+          <w:tcPr>
+            <w:tcW w:type="dxa" w:w="1440"/>
+          </w:tcPr>
+          <w:p>
+            <w:r>
+              <w:rPr>
+                <w:b/>
+                <w:sz w:val="18"/>
+              </w:rPr>
+              <w:t>TOTAL</w:t>
+            </w:r>
+          </w:p>
+        </w:tc>
+        <w:tc>
+          <w:tcPr>
+            <w:tcW w:type="dxa" w:w="1440"/>
+          </w:tcPr>
+          <w:p>
+            <w:r>
+              <w:rPr>
+                <w:b/>
+                <w:sz w:val="18"/>
+              </w:rPr>
+              <w:t>1,000</w:t>
+            </w:r>
+          </w:p>
+        </w:tc>
+        <w:tc>
+          <w:tcPr>
+            <w:tcW w:type="dxa" w:w="1440"/>
+          </w:tcPr>
+          <w:p>
+            <w:r>
+              <w:rPr>
+                <w:b/>
+                <w:sz w:val="18"/>
+              </w:rPr>
+              <w:t>1,812</w:t>
+            </w:r>
+          </w:p>
+        </w:tc>
+        <w:tc>
+          <w:tcPr>
+            <w:tcW w:type="dxa" w:w="1440"/>
+          </w:tcPr>
+          <w:p>
+            <w:r>
+              <w:rPr>
+                <w:b/>
+                <w:sz w:val="18"/>
+              </w:rPr>
+              <w:t>281</w:t>
+            </w:r>
+          </w:p>
+        </w:tc>
+        <w:tc>
+          <w:tcPr>
+            <w:tcW w:type="dxa" w:w="1440"/>
+          </w:tcPr>
+          <w:p>
+            <w:r>
+              <w:rPr>
+                <w:b/>
+                <w:sz w:val="18"/>
+              </w:rPr>
+              <w:t>10,006</w:t>
+            </w:r>
+          </w:p>
+        </w:tc>
+        <w:tc>
+          <w:tcPr>
+            <w:tcW w:type="dxa" w:w="1440"/>
+          </w:tcPr>
+          <w:p>
+            <w:r>
+              <w:rPr>
+                <w:b/>
+                <w:sz w:val="18"/>
+              </w:rPr>
+              <w:t>13,099</w:t>
             </w:r>
           </w:p>
         </w:tc>
@@ -887,7 +1486,7 @@
     <w:p/>
     <w:p>
       <w:r>
-        <w:t>Notes on the 2026 ministerial numbers:</w:t>
+        <w:t>Key patterns:</w:t>
       </w:r>
     </w:p>
     <w:p>
@@ -895,7 +1494,7 @@
         <w:pStyle w:val="ListBullet"/>
       </w:pPr>
       <w:r>
-        <w:t>57 of 60 single-family permits are North River Farms tract lots — a pre-entitled subdivision, not new development capacity.</w:t>
+        <w:t>5+ unit projects dominate total production — averaging 1,358 units/year from 2021–2025. In the first half of 2026, only 142 units were filed in this category, and that single project (DB26-00001) used AB 2011 to bypass city review.</w:t>
       </w:r>
     </w:p>
     <w:p>
@@ -903,7 +1502,7 @@
         <w:pStyle w:val="ListBullet"/>
       </w:pPr>
       <w:r>
-        <w:t>199 of 205 multi-family/mid-rise units are Olive Park Affordable Apartments (DB24-00001, approved 2024) — a single 100% affordable project pulling construction permits from a prior-year approval.</w:t>
+        <w:t>The 2022 peak (2,774 units in 5+ projects) followed the November 2021 removal of the downtown 43 du/acre cap. The October 2023 reimposition of a cap at 86 du/acre preceded the decline from 2,774 to 1,765 to 1,515 to 1,389.</w:t>
       </w:r>
     </w:p>
     <w:p>
@@ -911,7 +1510,53 @@
         <w:pStyle w:val="ListBullet"/>
       </w:pPr>
       <w:r>
-        <w:t>Of the 66 ADUs, only 1 has been issued. 26 were returned for correction and 23 are still in "received" status.</w:t>
+        <w:t>ADUs remained steady at ~150/year — the one type unaffected by local discretionary barriers.</w:t>
+      </w:r>
+    </w:p>
+    <w:p>
+      <w:pPr>
+        <w:pStyle w:val="ListBullet"/>
+      </w:pPr>
+      <w:r>
+        <w:t>SFD/SFA spiked in 2025 (409 units) due to North River Farms tract lots — a pre-entitled subdivision, not new development capacity.</w:t>
+      </w:r>
+    </w:p>
+    <w:p>
+      <w:pPr>
+        <w:pStyle w:val="ListBullet"/>
+      </w:pPr>
+      <w:r>
+        <w:t>2026 annualized (~478 units) would be the lowest production year since the city began reporting to HCD, below even the 2020 COVID year (399).</w:t>
+      </w:r>
+    </w:p>
+    <w:p/>
+    <w:p>
+      <w:r>
+        <w:t>Notes on 2026 data:</w:t>
+      </w:r>
+    </w:p>
+    <w:p>
+      <w:pPr>
+        <w:pStyle w:val="ListBullet"/>
+      </w:pPr>
+      <w:r>
+        <w:t>2026 HCD APR data will not be available until mid-2027. The 2026 figures are reconstructed from eTRAKiT permit and project searches.</w:t>
+      </w:r>
+    </w:p>
+    <w:p>
+      <w:pPr>
+        <w:pStyle w:val="ListBullet"/>
+      </w:pPr>
+      <w:r>
+        <w:t>Olive Park Affordable (199 units) and North River Farms SFDs (57 lots) were excluded from 2026 because they were already counted as filings in prior years' HCD data (DB24-00001 and the NRF subdivision, respectively).</w:t>
+      </w:r>
+    </w:p>
+    <w:p>
+      <w:pPr>
+        <w:pStyle w:val="ListBullet"/>
+      </w:pPr>
+      <w:r>
+        <w:t>The only 5+ unit filing in 2026 is DB26-00001 (142 units at 1640 Oceanside Blvd), a Density Bonus Application with a minimum of 21 affordable units (15% inclusionary). Without this state-law filing, the 5+ unit count would be zero.</w:t>
       </w:r>
     </w:p>
     <w:p>
@@ -924,22 +1569,7 @@
     </w:p>
     <w:p>
       <w:r>
-        <w:t>Excluding pre-entitled projects (North River Farms tract lots and Olive Park pulling from a 2024 approval), the city's organic 2026 housing production is:</w:t>
-      </w:r>
-    </w:p>
-    <w:p>
-      <w:r>
-        <w:rPr>
-          <w:b/>
-          <w:sz w:val="24"/>
-        </w:rPr>
-        <w:t>66 ADUs + 3 SFDs + 1 duplex + 6 multi-family units = 78 units in 5.5 months</w:t>
-      </w:r>
-    </w:p>
-    <w:p/>
-    <w:p>
-      <w:r>
-        <w:t>Annualized, that is approximately 170 units per year — in a city that averaged 2,290 units per year from 2022 to 2025.</w:t>
+        <w:t>The nine-year filing record reveals the full trajectory:</w:t>
       </w:r>
     </w:p>
     <w:tbl>
@@ -950,47 +1580,85 @@
         <w:tblLook w:firstColumn="1" w:firstRow="1" w:lastColumn="0" w:lastRow="0" w:noHBand="0" w:noVBand="1" w:val="04A0"/>
       </w:tblPr>
       <w:tblGrid>
-        <w:gridCol w:w="2880"/>
-        <w:gridCol w:w="2880"/>
-        <w:gridCol w:w="2880"/>
+        <w:gridCol w:w="1728"/>
+        <w:gridCol w:w="1728"/>
+        <w:gridCol w:w="1728"/>
+        <w:gridCol w:w="1728"/>
+        <w:gridCol w:w="1728"/>
       </w:tblGrid>
       <w:tr>
         <w:tc>
           <w:tcPr>
-            <w:tcW w:type="dxa" w:w="2880"/>
+            <w:tcW w:type="dxa" w:w="1728"/>
           </w:tcPr>
           <w:p>
             <w:r>
               <w:rPr>
                 <w:b/>
+                <w:sz w:val="18"/>
               </w:rPr>
-              <w:t>Metric</w:t>
             </w:r>
           </w:p>
         </w:tc>
         <w:tc>
           <w:tcPr>
-            <w:tcW w:type="dxa" w:w="2880"/>
+            <w:tcW w:type="dxa" w:w="1728"/>
           </w:tcPr>
           <w:p>
             <w:r>
               <w:rPr>
                 <w:b/>
+                <w:sz w:val="18"/>
               </w:rPr>
-              <w:t>2025</w:t>
+              <w:t>2021–2022</w:t>
+              <w:br/>
+              <w:t>(avg)</w:t>
             </w:r>
           </w:p>
         </w:tc>
         <w:tc>
           <w:tcPr>
-            <w:tcW w:type="dxa" w:w="2880"/>
+            <w:tcW w:type="dxa" w:w="1728"/>
           </w:tcPr>
           <w:p>
             <w:r>
               <w:rPr>
                 <w:b/>
+                <w:sz w:val="18"/>
               </w:rPr>
-              <w:t>2026 (annualized)</w:t>
+              <w:t>2023–2025</w:t>
+              <w:br/>
+              <w:t>(avg)</w:t>
+            </w:r>
+          </w:p>
+        </w:tc>
+        <w:tc>
+          <w:tcPr>
+            <w:tcW w:type="dxa" w:w="1728"/>
+          </w:tcPr>
+          <w:p>
+            <w:r>
+              <w:rPr>
+                <w:b/>
+                <w:sz w:val="18"/>
+              </w:rPr>
+              <w:t>2026*</w:t>
+              <w:br/>
+              <w:t>(annualized)</w:t>
+            </w:r>
+          </w:p>
+        </w:tc>
+        <w:tc>
+          <w:tcPr>
+            <w:tcW w:type="dxa" w:w="1728"/>
+          </w:tcPr>
+          <w:p>
+            <w:r>
+              <w:rPr>
+                <w:b/>
+                <w:sz w:val="18"/>
+              </w:rPr>
+              <w:t>Change</w:t>
             </w:r>
           </w:p>
         </w:tc>
@@ -998,31 +1666,68 @@
       <w:tr>
         <w:tc>
           <w:tcPr>
-            <w:tcW w:type="dxa" w:w="2880"/>
+            <w:tcW w:type="dxa" w:w="1728"/>
           </w:tcPr>
           <w:p>
             <w:r>
-              <w:t>Discretionary housing apps</w:t>
+              <w:rPr>
+                <w:sz w:val="18"/>
+              </w:rPr>
+              <w:t>Total units filed</w:t>
             </w:r>
           </w:p>
         </w:tc>
         <w:tc>
           <w:tcPr>
-            <w:tcW w:type="dxa" w:w="2880"/>
+            <w:tcW w:type="dxa" w:w="1728"/>
           </w:tcPr>
           <w:p>
             <w:r>
-              <w:t>18</w:t>
+              <w:rPr>
+                <w:sz w:val="18"/>
+              </w:rPr>
+              <w:t>2,448</w:t>
             </w:r>
           </w:p>
         </w:tc>
         <w:tc>
           <w:tcPr>
-            <w:tcW w:type="dxa" w:w="2880"/>
+            <w:tcW w:type="dxa" w:w="1728"/>
           </w:tcPr>
           <w:p>
             <w:r>
-              <w:t>~2</w:t>
+              <w:rPr>
+                <w:sz w:val="18"/>
+              </w:rPr>
+              <w:t>1,979</w:t>
+            </w:r>
+          </w:p>
+        </w:tc>
+        <w:tc>
+          <w:tcPr>
+            <w:tcW w:type="dxa" w:w="1728"/>
+          </w:tcPr>
+          <w:p>
+            <w:r>
+              <w:rPr>
+                <w:sz w:val="18"/>
+              </w:rPr>
+              <w:t>~478</w:t>
+            </w:r>
+          </w:p>
+        </w:tc>
+        <w:tc>
+          <w:tcPr>
+            <w:tcW w:type="dxa" w:w="1728"/>
+          </w:tcPr>
+          <w:p>
+            <w:r>
+              <w:rPr>
+                <w:b/>
+                <w:color w:val="8B0000"/>
+                <w:sz w:val="18"/>
+              </w:rPr>
+              <w:t>-80%</w:t>
             </w:r>
           </w:p>
         </w:tc>
@@ -1030,84 +1735,97 @@
       <w:tr>
         <w:tc>
           <w:tcPr>
-            <w:tcW w:type="dxa" w:w="2880"/>
+            <w:tcW w:type="dxa" w:w="1728"/>
           </w:tcPr>
           <w:p>
             <w:r>
-              <w:t>Ministerial housing units</w:t>
+              <w:rPr>
+                <w:sz w:val="18"/>
+              </w:rPr>
+              <w:t>5+ unit projects</w:t>
             </w:r>
           </w:p>
         </w:tc>
         <w:tc>
           <w:tcPr>
-            <w:tcW w:type="dxa" w:w="2880"/>
+            <w:tcW w:type="dxa" w:w="1728"/>
           </w:tcPr>
           <w:p>
             <w:r>
-              <w:t>~730</w:t>
+              <w:rPr>
+                <w:sz w:val="18"/>
+              </w:rPr>
+              <w:t>2,012</w:t>
             </w:r>
           </w:p>
         </w:tc>
         <w:tc>
           <w:tcPr>
-            <w:tcW w:type="dxa" w:w="2880"/>
+            <w:tcW w:type="dxa" w:w="1728"/>
           </w:tcPr>
           <w:p>
             <w:r>
-              <w:t>~170 (organic)</w:t>
+              <w:rPr>
+                <w:sz w:val="18"/>
+              </w:rPr>
+              <w:t>1,556</w:t>
             </w:r>
           </w:p>
         </w:tc>
-      </w:tr>
-      <w:tr>
         <w:tc>
           <w:tcPr>
-            <w:tcW w:type="dxa" w:w="2880"/>
+            <w:tcW w:type="dxa" w:w="1728"/>
+          </w:tcPr>
+          <w:p>
+            <w:r>
+              <w:rPr>
+                <w:sz w:val="18"/>
+              </w:rPr>
+              <w:t>~310</w:t>
+            </w:r>
+          </w:p>
+        </w:tc>
+        <w:tc>
+          <w:tcPr>
+            <w:tcW w:type="dxa" w:w="1728"/>
           </w:tcPr>
           <w:p>
             <w:r>
               <w:rPr>
                 <w:b/>
+                <w:color w:val="8B0000"/>
+                <w:sz w:val="18"/>
               </w:rPr>
-              <w:t>Total</w:t>
-            </w:r>
-          </w:p>
-        </w:tc>
-        <w:tc>
-          <w:tcPr>
-            <w:tcW w:type="dxa" w:w="2880"/>
-          </w:tcPr>
-          <w:p>
-            <w:r>
-              <w:rPr>
-                <w:b/>
-              </w:rPr>
-              <w:t>~1,700 (incl. APR)</w:t>
-            </w:r>
-          </w:p>
-        </w:tc>
-        <w:tc>
-          <w:tcPr>
-            <w:tcW w:type="dxa" w:w="2880"/>
-          </w:tcPr>
-          <w:p>
-            <w:r>
-              <w:rPr>
-                <w:b/>
-              </w:rPr>
-              <w:t>~370 (est.)</w:t>
+              <w:t>-85%</w:t>
             </w:r>
           </w:p>
         </w:tc>
       </w:tr>
     </w:tbl>
+    <w:p>
+      <w:pPr>
+        <w:pStyle w:val="ListBullet"/>
+      </w:pPr>
+      <w:r>
+        <w:t>* 2026 is Jan–Jun, annualized. 2026 data from eTRAKiT, deduped against prior-year HCD filings.</w:t>
+      </w:r>
+    </w:p>
     <w:p/>
     <w:p>
       <w:r>
         <w:rPr>
           <w:b/>
         </w:rPr>
-        <w:t>The RHNA target requires roughly 890 units per year. At the current organic pace, Oceanside will produce less than 20% of its annual obligation.</w:t>
+        <w:t>At 219 units filed in 5.5 months (annualized ~478), 2026 would be the lowest filing year since Oceanside began reporting to HCD — below even the 2020 COVID year (399 units). And the only 5+ unit project filed used state law to bypass local review entirely.</w:t>
+      </w:r>
+    </w:p>
+    <w:p/>
+    <w:p>
+      <w:r>
+        <w:rPr>
+          <w:b/>
+        </w:rPr>
+        <w:t>The RHNA target requires roughly 890 new units per year. At the current filing pace, Oceanside will produce less than half its annual obligation, accumulating a deficit that makes the 2029 deadline unreachable.</w:t>
       </w:r>
     </w:p>
     <w:p>
@@ -1214,7 +1932,7 @@
     </w:p>
     <w:p>
       <w:r>
-        <w:t>This is possible because the developer filed under AB 2011, which provides a ministerial (by-right) approval pathway for housing projects on commercially zoned land that meet affordability and labor requirements. The project does not require City Council approval, Planning Commission review, or CEQA analysis.</w:t>
+        <w:t>The project is filed as a Density Bonus Application (eTRAKiT type "DB"), invoking state density bonus law (Government Code §65915). Under Oceanside's inclusionary housing ordinance (Chapter 14C, updated December 2023 to 15%), the project must include a minimum of 21 deed-restricted affordable units at lower income levels (≤80% AMI). The actual affordable count may be higher if the developer offered additional affordable units in exchange for density bonus concessions.</w:t>
       </w:r>
     </w:p>
     <w:p>
@@ -1251,7 +1969,15 @@
         <w:pStyle w:val="ListBullet"/>
       </w:pPr>
       <w:r>
-        <w:t>Building permits: City of Oceanside eTRAKiT permit portal, permit search (BLDG-prefix permits). All 2,577 permits for 2025 and all 998 permits for 2026 were individually scraped and categorized by permit type.</w:t>
+        <w:t>Citywide housing filings (2018–2025): HCD Annual Progress Report Table A, APP_SUBMIT_DT field — same source and methodology as the D-District analysis.</w:t>
+      </w:r>
+    </w:p>
+    <w:p>
+      <w:pPr>
+        <w:pStyle w:val="ListBullet"/>
+      </w:pPr>
+      <w:r>
+        <w:t>2026 citywide filings: Reconstructed from eTRAKiT discretionary project search (D/DB/RD-prefix) and building permit search (BLDG-prefix, 20,702 permits scraped 2020–2026). Deduped against prior-year HCD filings to avoid double-counting Olive Park (DB24-00001) and North River Farms tract lots.</w:t>
       </w:r>
     </w:p>
     <w:p>
@@ -1291,7 +2017,7 @@
         <w:pStyle w:val="ListBullet"/>
       </w:pPr>
       <w:r>
-        <w:t>RHNA compliance: At the current organic production rate (~170 units/year), Oceanside will produce less than 20% of its annual RHNA obligation, accumulating a deficit that makes the 2029 deadline unreachable.</w:t>
+        <w:t>RHNA compliance: At the current filing rate (~478 units/year annualized, of which only 21 are affordable), Oceanside will produce barely half its annual RHNA obligation of ~890 units — accumulating a deficit that makes the 2029 deadline unreachable.</w:t>
       </w:r>
     </w:p>
     <w:p>

</xml_diff>